<commit_message>
Fix board brief header spacing in DOCX template output
</commit_message>
<xml_diff>
--- a/generated/board/board_brief_2026-02-27.docx
+++ b/generated/board/board_brief_2026-02-27.docx
@@ -8,32 +8,22 @@
         <w:pStyle w:val="Heading1"/>
       </w:pPr>
       <w:r>
-        <w:t xml:space="preserve">CivicOS Institute</w:t>
-      </w:r>
-    </w:p>
-    <w:bookmarkStart w:id="9" w:name="board-briefing-packet"/>
-    <w:p>
-      <w:pPr>
-        <w:pStyle w:val="Heading3"/>
-      </w:pPr>
-      <w:r>
-        <w:t xml:space="preserve">Board Briefing Packet</w:t>
+        <w:t xml:space="preserve">CIVICOS INSTITUTE</w:t>
+      </w:r>
+    </w:p>
+    <w:bookmarkStart w:id="9" w:name="board-intelligence-brief"/>
+    <w:p>
+      <w:pPr>
+        <w:pStyle w:val="Heading2"/>
+      </w:pPr>
+      <w:r>
+        <w:t xml:space="preserve">Board Intelligence Brief</w:t>
       </w:r>
     </w:p>
     <w:p>
       <w:pPr>
         <w:pStyle w:val="FirstParagraph"/>
       </w:pPr>
-      <w:r>
-        <w:rPr>
-          <w:b/>
-          <w:bCs/>
-        </w:rPr>
-        <w:t xml:space="preserve">Date:</w:t>
-      </w:r>
-      <w:r>
-        <w:t xml:space="preserve"> </w:t>
-      </w:r>
       <w:r>
         <w:t xml:space="preserve">2026-02-27</w:t>
       </w:r>

</xml_diff>

<commit_message>
Adopt Claude-owned board brief template and enforce data-only population rule
</commit_message>
<xml_diff>
--- a/generated/board/board_brief_2026-02-27.docx
+++ b/generated/board/board_brief_2026-02-27.docx
@@ -2,48 +2,7 @@
 <file path=word/document.xml><?xml version="1.0" encoding="utf-8"?>
 <w:document xmlns:w="http://schemas.openxmlformats.org/wordprocessingml/2006/main" xmlns:m="http://schemas.openxmlformats.org/officeDocument/2006/math" xmlns:r="http://schemas.openxmlformats.org/officeDocument/2006/relationships" xmlns:o="urn:schemas-microsoft-com:office:office" xmlns:v="urn:schemas-microsoft-com:vml" xmlns:w10="urn:schemas-microsoft-com:office:word" xmlns:a="http://schemas.openxmlformats.org/drawingml/2006/main" xmlns:pic="http://schemas.openxmlformats.org/drawingml/2006/picture" xmlns:wp="http://schemas.openxmlformats.org/drawingml/2006/wordprocessingDrawing">
   <w:body>
-    <w:p>
-      <w:pPr>
-        <w:spacing w:before="80" w:after="80"/>
-        <w:tabs>
-          <w:tab w:val="center" w:pos="4680"/>
-          <w:tab w:val="right" w:pos="9360"/>
-        </w:tabs>
-        <w:pBdr>
-          <w:bottom w:val="single" w:sz="6" w:space="4" w:color="auto"/>
-        </w:pBdr>
-      </w:pPr>
-      <w:r>
-        <w:rPr>
-          <w:b/>
-        </w:rPr>
-        <w:t>CIVICOS INSTITUTE</w:t>
-      </w:r>
-      <w:r>
-        <w:tab/>
-      </w:r>
-      <w:r>
-        <w:rPr>
-          <w:b/>
-        </w:rPr>
-        <w:t>Board Intelligence Brief</w:t>
-      </w:r>
-      <w:r>
-        <w:tab/>
-      </w:r>
-      <w:r>
-        <w:rPr>
-          <w:b/>
-        </w:rPr>
-        <w:t>February 27, 2026</w:t>
-      </w:r>
-    </w:p>
-    <w:p>
-      <w:pPr>
-        <w:spacing w:before="0" w:after="40"/>
-      </w:pPr>
-    </w:p>
-    <w:bookmarkStart w:id="20" w:name="civicos-board-brief-2026-02-27"/>
+    <w:bookmarkStart w:id="27" w:name="civicos-board-brief-2026-02-27"/>
     <w:p>
       <w:pPr>
         <w:pStyle w:val="Heading1"/>
@@ -52,7 +11,7 @@
         <w:t xml:space="preserve">CivicOS Board Brief — 2026-02-27</w:t>
       </w:r>
     </w:p>
-    <w:bookmarkStart w:id="9" w:name="executive-summary"/>
+    <w:bookmarkStart w:id="16" w:name="executive-summary"/>
     <w:p>
       <w:pPr>
         <w:pStyle w:val="Heading2"/>
@@ -97,8 +56,8 @@
         <w:t xml:space="preserve">Website analytics snapshot included from latest GA4 daily pull.</w:t>
       </w:r>
     </w:p>
-    <w:bookmarkEnd w:id="9"/>
-    <w:bookmarkStart w:id="17" w:name="signal-intelligence"/>
+    <w:bookmarkEnd w:id="16"/>
+    <w:bookmarkStart w:id="24" w:name="signal-intelligence"/>
     <w:p>
       <w:pPr>
         <w:pStyle w:val="Heading2"/>
@@ -107,7 +66,7 @@
         <w:t xml:space="preserve">Signal Intelligence</w:t>
       </w:r>
     </w:p>
-    <w:bookmarkStart w:id="11" w:name="X92e4e5faa1c3a239089eba81afb783723902bff"/>
+    <w:bookmarkStart w:id="18" w:name="X92e4e5faa1c3a239089eba81afb783723902bff"/>
     <w:p>
       <w:pPr>
         <w:pStyle w:val="Heading3"/>
@@ -130,7 +89,7 @@
       <w:r>
         <w:t xml:space="preserve"> </w:t>
       </w:r>
-      <w:hyperlink r:id="rId10">
+      <w:hyperlink r:id="rId17">
         <w:r>
           <w:rPr>
             <w:rStyle w:val="Hyperlink"/>
@@ -187,8 +146,8 @@
         <w:t xml:space="preserve">Next step: assign an owner to produce a 1-page briefing memo and recommendation within 48 hours.</w:t>
       </w:r>
     </w:p>
-    <w:bookmarkEnd w:id="11"/>
-    <w:bookmarkStart w:id="14" w:name="X87dddb7aae994c70bca403245430876adfe966e"/>
+    <w:bookmarkEnd w:id="18"/>
+    <w:bookmarkStart w:id="21" w:name="X87dddb7aae994c70bca403245430876adfe966e"/>
     <w:p>
       <w:pPr>
         <w:pStyle w:val="Heading3"/>
@@ -211,7 +170,7 @@
       <w:r>
         <w:t xml:space="preserve"> </w:t>
       </w:r>
-      <w:hyperlink r:id="rId12">
+      <w:hyperlink r:id="rId19">
         <w:r>
           <w:rPr>
             <w:rStyle w:val="Hyperlink"/>
@@ -234,7 +193,7 @@
       <w:r>
         <w:t xml:space="preserve"> </w:t>
       </w:r>
-      <w:hyperlink r:id="rId13">
+      <w:hyperlink r:id="rId20">
         <w:r>
           <w:rPr>
             <w:rStyle w:val="Hyperlink"/>
@@ -279,8 +238,8 @@
         <w:t xml:space="preserve">Next step: assign an owner to produce a 1-page briefing memo and recommendation within 48 hours.</w:t>
       </w:r>
     </w:p>
-    <w:bookmarkEnd w:id="14"/>
-    <w:bookmarkStart w:id="16" w:name="X57ee30b446734b08766eb6e73eae1b21cf006a4"/>
+    <w:bookmarkEnd w:id="21"/>
+    <w:bookmarkStart w:id="23" w:name="X57ee30b446734b08766eb6e73eae1b21cf006a4"/>
     <w:p>
       <w:pPr>
         <w:pStyle w:val="Heading3"/>
@@ -303,7 +262,7 @@
       <w:r>
         <w:t xml:space="preserve"> </w:t>
       </w:r>
-      <w:hyperlink r:id="rId15">
+      <w:hyperlink r:id="rId22">
         <w:r>
           <w:rPr>
             <w:rStyle w:val="Hyperlink"/>
@@ -360,9 +319,9 @@
         <w:t xml:space="preserve">Next step: assign an owner to produce a 1-page briefing memo and recommendation within 48 hours.</w:t>
       </w:r>
     </w:p>
-    <w:bookmarkEnd w:id="16"/>
-    <w:bookmarkEnd w:id="17"/>
-    <w:bookmarkStart w:id="18" w:name="stakeholder-activity-past-7-days"/>
+    <w:bookmarkEnd w:id="23"/>
+    <w:bookmarkEnd w:id="24"/>
+    <w:bookmarkStart w:id="25" w:name="stakeholder-activity-past-7-days"/>
     <w:p>
       <w:pPr>
         <w:pStyle w:val="Heading2"/>
@@ -395,8 +354,8 @@
         <w:t xml:space="preserve">CRM sync stats: processed=0, matched=0, manual_review=0</w:t>
       </w:r>
     </w:p>
-    <w:bookmarkEnd w:id="18"/>
-    <w:bookmarkStart w:id="19" w:name="website-reach-ga4-summary"/>
+    <w:bookmarkEnd w:id="25"/>
+    <w:bookmarkStart w:id="26" w:name="website-reach-ga4-summary"/>
     <w:p>
       <w:pPr>
         <w:pStyle w:val="Heading2"/>
@@ -405,9 +364,9 @@
         <w:t xml:space="preserve">Website &amp; Reach (GA4 summary)</w:t>
       </w:r>
     </w:p>
-    <w:bookmarkEnd w:id="19"/>
-    <w:bookmarkEnd w:id="20"/>
-    <w:bookmarkStart w:id="24" w:name="ga4-daily-pull"/>
+    <w:bookmarkEnd w:id="26"/>
+    <w:bookmarkEnd w:id="27"/>
+    <w:bookmarkStart w:id="31" w:name="ga4-daily-pull"/>
     <w:p>
       <w:pPr>
         <w:pStyle w:val="Heading1"/>
@@ -472,7 +431,7 @@
         <w:t xml:space="preserve">Sessions: 0 (prev 0, WoW None%)</w:t>
       </w:r>
     </w:p>
-    <w:bookmarkStart w:id="21" w:name="top-sourcemedium"/>
+    <w:bookmarkStart w:id="28" w:name="top-sourcemedium"/>
     <w:p>
       <w:pPr>
         <w:pStyle w:val="Heading2"/>
@@ -481,8 +440,8 @@
         <w:t xml:space="preserve">Top Source/Medium</w:t>
       </w:r>
     </w:p>
-    <w:bookmarkEnd w:id="21"/>
-    <w:bookmarkStart w:id="22" w:name="top-pages"/>
+    <w:bookmarkEnd w:id="28"/>
+    <w:bookmarkStart w:id="29" w:name="top-pages"/>
     <w:p>
       <w:pPr>
         <w:pStyle w:val="Heading2"/>
@@ -491,8 +450,8 @@
         <w:t xml:space="preserve">Top Pages</w:t>
       </w:r>
     </w:p>
-    <w:bookmarkEnd w:id="22"/>
-    <w:bookmarkStart w:id="23" w:name="recommended-actions"/>
+    <w:bookmarkEnd w:id="29"/>
+    <w:bookmarkStart w:id="30" w:name="recommended-actions"/>
     <w:p>
       <w:pPr>
         <w:pStyle w:val="Heading2"/>
@@ -610,12 +569,15 @@
         </w:tc>
       </w:tr>
     </w:tbl>
-    <w:bookmarkEnd w:id="23"/>
-    <w:bookmarkEnd w:id="24"/>
+    <w:bookmarkEnd w:id="30"/>
+    <w:bookmarkEnd w:id="31"/>
     <w:sectPr>
-      <w:footnotePr>
-        <w:numRestart w:val="eachSect"/>
-      </w:footnotePr>
+      <w:headerReference r:id="rId6" w:type="default"/>
+      <w:footerReference r:id="rId7" w:type="default"/>
+      <w:pgSz w:h="15840" w:orient="portrait" w:w="12240"/>
+      <w:pgMar w:bottom="1080" w:footer="708" w:gutter="0" w:header="708" w:left="1080" w:right="1080" w:top="1080"/>
+      <w:pgNumType/>
+      <w:docGrid w:linePitch="360"/>
     </w:sectPr>
   </w:body>
 </w:document>
@@ -625,6 +587,53 @@
 <w:comments xmlns:w="http://schemas.openxmlformats.org/wordprocessingml/2006/main" xmlns:m="http://schemas.openxmlformats.org/officeDocument/2006/math" xmlns:r="http://schemas.openxmlformats.org/officeDocument/2006/relationships" xmlns:o="urn:schemas-microsoft-com:office:office" xmlns:v="urn:schemas-microsoft-com:vml" xmlns:w10="urn:schemas-microsoft-com:office:word" xmlns:a="http://schemas.openxmlformats.org/drawingml/2006/main" xmlns:pic="http://schemas.openxmlformats.org/drawingml/2006/picture" xmlns:wp="http://schemas.openxmlformats.org/drawingml/2006/wordprocessingDrawing"/>
 </file>
 
+<file path=word/footer1.xml><?xml version="1.0" encoding="utf-8"?>
+<w:ftr xmlns:wpc="http://schemas.microsoft.com/office/word/2010/wordprocessingCanvas" xmlns:mc="http://schemas.openxmlformats.org/markup-compatibility/2006" xmlns:o="urn:schemas-microsoft-com:office:office" xmlns:r="http://schemas.openxmlformats.org/officeDocument/2006/relationships" xmlns:m="http://schemas.openxmlformats.org/officeDocument/2006/math" xmlns:v="urn:schemas-microsoft-com:vml" xmlns:wp14="http://schemas.microsoft.com/office/word/2010/wordprocessingDrawing" xmlns:wp="http://schemas.openxmlformats.org/drawingml/2006/wordprocessingDrawing" xmlns:w10="urn:schemas-microsoft-com:office:word" xmlns:w="http://schemas.openxmlformats.org/wordprocessingml/2006/main" xmlns:w14="http://schemas.microsoft.com/office/word/2010/wordml" xmlns:w15="http://schemas.microsoft.com/office/word/2012/wordml" xmlns:wpg="http://schemas.microsoft.com/office/word/2010/wordprocessingGroup" xmlns:wpi="http://schemas.microsoft.com/office/word/2010/wordprocessingInk" xmlns:wne="http://schemas.microsoft.com/office/word/2006/wordml" xmlns:wps="http://schemas.microsoft.com/office/word/2010/wordprocessingShape">
+  <w:p>
+    <w:pPr>
+      <w:pBdr>
+        <w:top w:val="single" w:color="CCCCCC" w:sz="4" w:space="4"/>
+      </w:pBdr>
+      <w:tabs>
+        <w:tab w:val="right" w:pos="9026"/>
+      </w:tabs>
+    </w:pPr>
+    <w:r>
+      <w:rPr>
+        <w:rFonts w:ascii="Arial" w:cs="Arial" w:eastAsia="Arial" w:hAnsi="Arial"/>
+        <w:i/>
+        <w:iCs/>
+        <w:color w:val="666666"/>
+        <w:sz w:val="16"/>
+        <w:szCs w:val="16"/>
+      </w:rPr>
+      <w:t xml:space="preserve">CONFIDENTIAL — CivicOS Institute Internal Use Only</w:t>
+    </w:r>
+    <w:r>
+      <w:rPr>
+        <w:rFonts w:ascii="Arial" w:cs="Arial" w:eastAsia="Arial" w:hAnsi="Arial"/>
+        <w:color w:val="666666"/>
+        <w:sz w:val="16"/>
+        <w:szCs w:val="16"/>
+      </w:rPr>
+      <w:t xml:space="preserve">	Page </w:t>
+    </w:r>
+    <w:r>
+      <w:rPr>
+        <w:rFonts w:ascii="Arial" w:cs="Arial" w:eastAsia="Arial" w:hAnsi="Arial"/>
+        <w:color w:val="666666"/>
+        <w:sz w:val="16"/>
+        <w:szCs w:val="16"/>
+      </w:rPr>
+      <w:fldChar w:fldCharType="begin"/>
+      <w:instrText xml:space="preserve">PAGE</w:instrText>
+      <w:fldChar w:fldCharType="separate"/>
+      <w:fldChar w:fldCharType="end"/>
+    </w:r>
+  </w:p>
+</w:ftr>
+</file>
+
 <file path=word/footnotes.xml><?xml version="1.0" encoding="utf-8"?>
 <w:footnotes xmlns:w="http://schemas.openxmlformats.org/wordprocessingml/2006/main" xmlns:m="http://schemas.openxmlformats.org/officeDocument/2006/math" xmlns:r="http://schemas.openxmlformats.org/officeDocument/2006/relationships" xmlns:o="urn:schemas-microsoft-com:office:office" xmlns:v="urn:schemas-microsoft-com:vml" xmlns:w10="urn:schemas-microsoft-com:office:word" xmlns:a="http://schemas.openxmlformats.org/drawingml/2006/main" xmlns:pic="http://schemas.openxmlformats.org/drawingml/2006/picture" xmlns:wp="http://schemas.openxmlformats.org/drawingml/2006/wordprocessingDrawing">
   <w:footnote w:type="continuationSeparator" w:id="0">
@@ -644,8 +653,149 @@
 </w:footnotes>
 </file>
 
+<file path=word/header1.xml><?xml version="1.0" encoding="utf-8"?>
+<w:hdr xmlns:wpc="http://schemas.microsoft.com/office/word/2010/wordprocessingCanvas" xmlns:mc="http://schemas.openxmlformats.org/markup-compatibility/2006" xmlns:o="urn:schemas-microsoft-com:office:office" xmlns:r="http://schemas.openxmlformats.org/officeDocument/2006/relationships" xmlns:m="http://schemas.openxmlformats.org/officeDocument/2006/math" xmlns:v="urn:schemas-microsoft-com:vml" xmlns:wp14="http://schemas.microsoft.com/office/word/2010/wordprocessingDrawing" xmlns:wp="http://schemas.openxmlformats.org/drawingml/2006/wordprocessingDrawing" xmlns:w10="urn:schemas-microsoft-com:office:word" xmlns:w="http://schemas.openxmlformats.org/wordprocessingml/2006/main" xmlns:w14="http://schemas.microsoft.com/office/word/2010/wordml" xmlns:w15="http://schemas.microsoft.com/office/word/2012/wordml" xmlns:wpg="http://schemas.microsoft.com/office/word/2010/wordprocessingGroup" xmlns:wpi="http://schemas.microsoft.com/office/word/2010/wordprocessingInk" xmlns:wne="http://schemas.microsoft.com/office/word/2006/wordml" xmlns:wps="http://schemas.microsoft.com/office/word/2010/wordprocessingShape" xmlns:cx="http://schemas.microsoft.com/office/drawing/2014/chartex" xmlns:cx1="http://schemas.microsoft.com/office/drawing/2015/9/8/chartex" xmlns:cx2="http://schemas.microsoft.com/office/drawing/2015/10/21/chartex" xmlns:cx3="http://schemas.microsoft.com/office/drawing/2016/5/9/chartex" xmlns:cx4="http://schemas.microsoft.com/office/drawing/2016/5/10/chartex" xmlns:cx5="http://schemas.microsoft.com/office/drawing/2016/5/11/chartex" xmlns:cx6="http://schemas.microsoft.com/office/drawing/2016/5/12/chartex" xmlns:cx7="http://schemas.microsoft.com/office/drawing/2016/5/13/chartex" xmlns:cx8="http://schemas.microsoft.com/office/drawing/2016/5/14/chartex" xmlns:w16cid="http://schemas.microsoft.com/office/word/2016/wordml/cid" xmlns:w16se="http://schemas.microsoft.com/office/word/2015/wordml/symex">
+  <w:p>
+    <w:pPr>
+      <w:pBdr>
+        <w:bottom w:val="single" w:color="1B3A6B" w:sz="6" w:space="4"/>
+      </w:pBdr>
+      <w:tabs>
+        <w:tab w:val="center" w:pos="4680"/>
+        <w:tab w:val="right" w:pos="9026"/>
+      </w:tabs>
+    </w:pPr>
+    <w:r>
+      <w:rPr>
+        <w:rFonts w:ascii="Arial" w:cs="Arial" w:eastAsia="Arial" w:hAnsi="Arial"/>
+        <w:b/>
+        <w:bCs/>
+        <w:color w:val="1B3A6B"/>
+        <w:sz w:val="20"/>
+        <w:szCs w:val="20"/>
+      </w:rPr>
+      <w:t xml:space="preserve">CIVICOS INSTITUTE</w:t>
+    </w:r>
+    <w:r>
+      <w:rPr>
+        <w:rFonts w:ascii="Arial" w:cs="Arial" w:eastAsia="Arial" w:hAnsi="Arial"/>
+        <w:color w:val="666666"/>
+        <w:sz w:val="19"/>
+        <w:szCs w:val="19"/>
+      </w:rPr>
+      <w:t xml:space="preserve">	Board Intelligence Brief</w:t>
+    </w:r>
+    <w:r>
+      <w:rPr>
+        <w:rFonts w:ascii="Arial" w:cs="Arial" w:eastAsia="Arial" w:hAnsi="Arial"/>
+        <w:color w:val="666666"/>
+        <w:sz w:val="19"/>
+        <w:szCs w:val="19"/>
+      </w:rPr>
+      <w:t xml:space="preserve">	February 27, 2026</w:t>
+    </w:r>
+  </w:p>
+</w:hdr>
+</file>
+
 <file path=word/numbering.xml><?xml version="1.0" encoding="utf-8"?>
-<w:numbering xmlns:w="http://schemas.openxmlformats.org/wordprocessingml/2006/main">
+<w:numbering xmlns:m="http://schemas.openxmlformats.org/officeDocument/2006/math" xmlns:mc="http://schemas.openxmlformats.org/markup-compatibility/2006" xmlns:o="urn:schemas-microsoft-com:office:office" xmlns:r="http://schemas.openxmlformats.org/officeDocument/2006/relationships" xmlns:v="urn:schemas-microsoft-com:vml" xmlns:w="http://schemas.openxmlformats.org/wordprocessingml/2006/main" xmlns:w10="urn:schemas-microsoft-com:office:word" xmlns:w14="http://schemas.microsoft.com/office/word/2010/wordml" xmlns:w15="http://schemas.microsoft.com/office/word/2012/wordml" xmlns:wne="http://schemas.microsoft.com/office/word/2006/wordml" xmlns:wp="http://schemas.openxmlformats.org/drawingml/2006/wordprocessingDrawing" xmlns:wp14="http://schemas.microsoft.com/office/word/2010/wordprocessingDrawing" xmlns:wpc="http://schemas.microsoft.com/office/word/2010/wordprocessingCanvas" xmlns:wpg="http://schemas.microsoft.com/office/word/2010/wordprocessingGroup" xmlns:wpi="http://schemas.microsoft.com/office/word/2010/wordprocessingInk" xmlns:wps="http://schemas.microsoft.com/office/word/2010/wordprocessingShape" mc:Ignorable="w14 w15 wp14">
+  <w:abstractNum w15:restartNumberingAfterBreak="0" w:abstractNumId="1">
+    <w:multiLevelType w:val="hybridMultilevel"/>
+    <w:lvl w15:tentative="1" w:ilvl="0">
+      <w:start w:val="1"/>
+      <w:numFmt w:val="bullet"/>
+      <w:lvlText w:val="●"/>
+      <w:lvlJc w:val="left"/>
+      <w:pPr>
+        <w:ind w:hanging="360" w:left="720"/>
+      </w:pPr>
+    </w:lvl>
+    <w:lvl w15:tentative="1" w:ilvl="1">
+      <w:start w:val="1"/>
+      <w:numFmt w:val="bullet"/>
+      <w:lvlText w:val="○"/>
+      <w:lvlJc w:val="left"/>
+      <w:pPr>
+        <w:ind w:hanging="360" w:left="1440"/>
+      </w:pPr>
+    </w:lvl>
+    <w:lvl w15:tentative="1" w:ilvl="2">
+      <w:start w:val="1"/>
+      <w:numFmt w:val="bullet"/>
+      <w:lvlText w:val="■"/>
+      <w:lvlJc w:val="left"/>
+      <w:pPr>
+        <w:ind w:hanging="360" w:left="2160"/>
+      </w:pPr>
+    </w:lvl>
+    <w:lvl w15:tentative="1" w:ilvl="3">
+      <w:start w:val="1"/>
+      <w:numFmt w:val="bullet"/>
+      <w:lvlText w:val="●"/>
+      <w:lvlJc w:val="left"/>
+      <w:pPr>
+        <w:ind w:hanging="360" w:left="2880"/>
+      </w:pPr>
+    </w:lvl>
+    <w:lvl w15:tentative="1" w:ilvl="4">
+      <w:start w:val="1"/>
+      <w:numFmt w:val="bullet"/>
+      <w:lvlText w:val="○"/>
+      <w:lvlJc w:val="left"/>
+      <w:pPr>
+        <w:ind w:hanging="360" w:left="3600"/>
+      </w:pPr>
+    </w:lvl>
+    <w:lvl w15:tentative="1" w:ilvl="5">
+      <w:start w:val="1"/>
+      <w:numFmt w:val="bullet"/>
+      <w:lvlText w:val="■"/>
+      <w:lvlJc w:val="left"/>
+      <w:pPr>
+        <w:ind w:hanging="360" w:left="4320"/>
+      </w:pPr>
+    </w:lvl>
+    <w:lvl w15:tentative="1" w:ilvl="6">
+      <w:start w:val="1"/>
+      <w:numFmt w:val="bullet"/>
+      <w:lvlText w:val="●"/>
+      <w:lvlJc w:val="left"/>
+      <w:pPr>
+        <w:ind w:hanging="360" w:left="5040"/>
+      </w:pPr>
+    </w:lvl>
+    <w:lvl w15:tentative="1" w:ilvl="7">
+      <w:start w:val="1"/>
+      <w:numFmt w:val="bullet"/>
+      <w:lvlText w:val="●"/>
+      <w:lvlJc w:val="left"/>
+      <w:pPr>
+        <w:ind w:hanging="360" w:left="5760"/>
+      </w:pPr>
+    </w:lvl>
+    <w:lvl w15:tentative="1" w:ilvl="8">
+      <w:start w:val="1"/>
+      <w:numFmt w:val="bullet"/>
+      <w:lvlText w:val="●"/>
+      <w:lvlJc w:val="left"/>
+      <w:pPr>
+        <w:ind w:hanging="360" w:left="6480"/>
+      </w:pPr>
+    </w:lvl>
+  </w:abstractNum>
+  <w:abstractNum w15:restartNumberingAfterBreak="0" w:abstractNumId="2">
+    <w:multiLevelType w:val="hybridMultilevel"/>
+    <w:lvl w15:tentative="1" w:ilvl="0">
+      <w:start w:val="1"/>
+      <w:numFmt w:val="bullet"/>
+      <w:lvlText w:val="•"/>
+      <w:lvlJc w:val="left"/>
+      <w:pPr>
+        <w:ind w:hanging="360" w:left="720"/>
+      </w:pPr>
+    </w:lvl>
+  </w:abstractNum>
   <w:abstractNum w:abstractNumId="990">
     <w:nsid w:val="0000A990"/>
     <w:multiLevelType w:val="multilevel"/>
@@ -825,6 +975,18 @@
       </w:rPr>
     </w:lvl>
   </w:abstractNum>
+  <w:num w:numId="1">
+    <w:abstractNumId w:val="1"/>
+    <w:lvlOverride w:ilvl="0">
+      <w:startOverride w:val="1"/>
+    </w:lvlOverride>
+  </w:num>
+  <w:num w:numId="2">
+    <w:abstractNumId w:val="2"/>
+    <w:lvlOverride w:ilvl="0">
+      <w:startOverride w:val="1"/>
+    </w:lvlOverride>
+  </w:num>
   <w:num w:numId="1000">
     <w:abstractNumId w:val="990"/>
   </w:num>
@@ -850,659 +1012,167 @@
 </file>
 
 <file path=word/styles.xml><?xml version="1.0" encoding="utf-8"?>
-<w:styles xmlns:r="http://schemas.openxmlformats.org/officeDocument/2006/relationships" xmlns:w="http://schemas.openxmlformats.org/wordprocessingml/2006/main">
+<w:styles xmlns:mc="http://schemas.openxmlformats.org/markup-compatibility/2006" xmlns:r="http://schemas.openxmlformats.org/officeDocument/2006/relationships" xmlns:w="http://schemas.openxmlformats.org/wordprocessingml/2006/main" xmlns:w14="http://schemas.microsoft.com/office/word/2010/wordml" xmlns:w15="http://schemas.microsoft.com/office/word/2012/wordml" mc:Ignorable="w14 w15">
   <w:docDefaults>
     <w:rPrDefault>
       <w:rPr>
-        <w:rFonts w:asciiTheme="minorHAnsi" w:cstheme="minorBidi" w:eastAsiaTheme="minorEastAsia" w:hAnsiTheme="minorHAnsi"/>
-        <w:sz w:val="24"/>
-        <w:szCs w:val="24"/>
-        <w:lang w:bidi="ar-SA" w:eastAsia="zh-CN" w:val="en-US"/>
+        <w:rFonts w:ascii="Arial" w:cs="Arial" w:eastAsia="Arial" w:hAnsi="Arial"/>
+        <w:sz w:val="20"/>
+        <w:szCs w:val="20"/>
       </w:rPr>
     </w:rPrDefault>
-    <w:pPrDefault>
-      <w:pPr>
-        <w:spacing w:after="200"/>
-      </w:pPr>
-    </w:pPrDefault>
+    <w:pPrDefault/>
   </w:docDefaults>
-  <w:latentStyles w:count="276" w:defLockedState="0" w:defQFormat="0" w:defSemiHidden="0" w:defUIPriority="0" w:defUnhideWhenUsed="0"/>
-  <w:style w:default="1" w:styleId="Normal" w:type="paragraph">
-    <w:name w:val="Normal"/>
-    <w:qFormat/>
-  </w:style>
-  <w:style w:styleId="BodyText" w:type="paragraph">
-    <w:name w:val="Body Text"/>
-    <w:basedOn w:val="Normal"/>
-    <w:link w:val="BodyTextChar"/>
-    <w:qFormat/>
-    <w:pPr>
-      <w:spacing w:after="180" w:before="180"/>
-    </w:pPr>
-  </w:style>
-  <w:style w:customStyle="1" w:styleId="FirstParagraph" w:type="paragraph">
-    <w:name w:val="First Paragraph"/>
-    <w:basedOn w:val="BodyText"/>
-    <w:next w:val="BodyText"/>
-    <w:qFormat/>
-  </w:style>
-  <w:style w:customStyle="1" w:styleId="Compact" w:type="paragraph">
-    <w:name w:val="Compact"/>
-    <w:basedOn w:val="BodyText"/>
-    <w:qFormat/>
-    <w:pPr>
-      <w:spacing w:after="36" w:before="36"/>
-    </w:pPr>
-  </w:style>
   <w:style w:styleId="Title" w:type="paragraph">
     <w:name w:val="Title"/>
     <w:basedOn w:val="Normal"/>
-    <w:next w:val="BodyText"/>
-    <w:link w:val="TitleChar"/>
-    <w:uiPriority w:val="10"/>
+    <w:next w:val="Normal"/>
     <w:qFormat/>
-    <w:rsid w:val="00A10FD9"/>
-    <w:pPr>
-      <w:spacing w:after="80" w:line="240" w:lineRule="auto"/>
-      <w:contextualSpacing/>
-      <w:jc w:val="center"/>
-    </w:pPr>
-    <w:rPr>
-      <w:rFonts w:asciiTheme="majorHAnsi" w:cstheme="majorBidi" w:eastAsiaTheme="majorEastAsia" w:hAnsiTheme="majorHAnsi"/>
+    <w:rPr>
       <w:sz w:val="56"/>
       <w:szCs w:val="56"/>
     </w:rPr>
   </w:style>
-  <w:style w:customStyle="1" w:styleId="TitleChar" w:type="character">
-    <w:name w:val="Title Char"/>
+  <w:style w:styleId="Heading1" w:type="paragraph">
+    <w:name w:val="Heading 1"/>
+    <w:basedOn w:val="Normal"/>
+    <w:next w:val="Normal"/>
+    <w:qFormat/>
+    <w:rPr>
+      <w:color w:val="2E74B5"/>
+      <w:sz w:val="32"/>
+      <w:szCs w:val="32"/>
+    </w:rPr>
+  </w:style>
+  <w:style w:styleId="Heading2" w:type="paragraph">
+    <w:name w:val="Heading 2"/>
+    <w:basedOn w:val="Normal"/>
+    <w:next w:val="Normal"/>
+    <w:qFormat/>
+    <w:rPr>
+      <w:color w:val="2E74B5"/>
+      <w:sz w:val="26"/>
+      <w:szCs w:val="26"/>
+    </w:rPr>
+  </w:style>
+  <w:style w:styleId="Heading3" w:type="paragraph">
+    <w:name w:val="Heading 3"/>
+    <w:basedOn w:val="Normal"/>
+    <w:next w:val="Normal"/>
+    <w:qFormat/>
+    <w:rPr>
+      <w:color w:val="1F4D78"/>
+      <w:sz w:val="24"/>
+      <w:szCs w:val="24"/>
+    </w:rPr>
+  </w:style>
+  <w:style w:styleId="Heading4" w:type="paragraph">
+    <w:name w:val="Heading 4"/>
+    <w:basedOn w:val="Normal"/>
+    <w:next w:val="Normal"/>
+    <w:qFormat/>
+    <w:rPr>
+      <w:i/>
+      <w:iCs/>
+      <w:color w:val="2E74B5"/>
+    </w:rPr>
+  </w:style>
+  <w:style w:styleId="Heading5" w:type="paragraph">
+    <w:name w:val="Heading 5"/>
+    <w:basedOn w:val="Normal"/>
+    <w:next w:val="Normal"/>
+    <w:qFormat/>
+    <w:rPr>
+      <w:color w:val="2E74B5"/>
+    </w:rPr>
+  </w:style>
+  <w:style w:styleId="Heading6" w:type="paragraph">
+    <w:name w:val="Heading 6"/>
+    <w:basedOn w:val="Normal"/>
+    <w:next w:val="Normal"/>
+    <w:qFormat/>
+    <w:rPr>
+      <w:color w:val="1F4D78"/>
+    </w:rPr>
+  </w:style>
+  <w:style w:styleId="Strong" w:type="paragraph">
+    <w:name w:val="Strong"/>
+    <w:basedOn w:val="Normal"/>
+    <w:next w:val="Normal"/>
+    <w:qFormat/>
+    <w:rPr>
+      <w:b/>
+      <w:bCs/>
+    </w:rPr>
+  </w:style>
+  <w:style w:styleId="ListParagraph" w:type="paragraph">
+    <w:name w:val="List Paragraph"/>
+    <w:basedOn w:val="Normal"/>
+    <w:qFormat/>
+  </w:style>
+  <w:style w:styleId="Hyperlink" w:type="character">
+    <w:name w:val="Hyperlink"/>
     <w:basedOn w:val="DefaultParagraphFont"/>
-    <w:link w:val="Title"/>
-    <w:uiPriority w:val="10"/>
-    <w:rsid w:val="00A10FD9"/>
-    <w:rPr>
-      <w:rFonts w:asciiTheme="majorHAnsi" w:cstheme="majorBidi" w:eastAsiaTheme="majorEastAsia" w:hAnsiTheme="majorHAnsi"/>
-      <w:sz w:val="56"/>
-      <w:szCs w:val="56"/>
-    </w:rPr>
-  </w:style>
-  <w:style w:styleId="Subtitle" w:type="paragraph">
-    <w:name w:val="Subtitle"/>
-    <w:basedOn w:val="Title"/>
-    <w:next w:val="BodyText"/>
-    <w:link w:val="SubtitleChar"/>
-    <w:uiPriority w:val="11"/>
-    <w:qFormat/>
-    <w:rsid w:val="00A10FD9"/>
+    <w:uiPriority w:val="99"/>
+    <w:unhideWhenUsed/>
+    <w:rPr>
+      <w:color w:val="0563C1"/>
+      <w:u w:val="single"/>
+    </w:rPr>
+  </w:style>
+  <w:style w:styleId="FootnoteReference" w:type="character">
+    <w:name w:val="footnote reference"/>
+    <w:basedOn w:val="DefaultParagraphFont"/>
+    <w:uiPriority w:val="99"/>
+    <w:semiHidden/>
+    <w:unhideWhenUsed/>
+    <w:rPr>
+      <w:vertAlign w:val="superscript"/>
+    </w:rPr>
+  </w:style>
+  <w:style w:styleId="FootnoteText" w:type="paragraph">
+    <w:name w:val="footnote text"/>
+    <w:basedOn w:val="Normal"/>
+    <w:link w:val="FootnoteTextChar"/>
+    <w:uiPriority w:val="99"/>
+    <w:semiHidden/>
+    <w:unhideWhenUsed/>
     <w:pPr>
-      <w:numPr>
-        <w:ilvl w:val="1"/>
-      </w:numPr>
+      <w:spacing w:after="0" w:line="240" w:lineRule="auto"/>
     </w:pPr>
     <w:rPr>
-      <w:rFonts w:cstheme="majorBidi" w:eastAsiaTheme="majorEastAsia"/>
-      <w:spacing w:val="15"/>
-      <w:sz w:val="28"/>
-      <w:szCs w:val="28"/>
-    </w:rPr>
-  </w:style>
-  <w:style w:customStyle="1" w:styleId="SubtitleChar" w:type="character">
-    <w:name w:val="Subtitle Char"/>
+      <w:sz w:val="20"/>
+      <w:szCs w:val="20"/>
+    </w:rPr>
+  </w:style>
+  <w:style w:styleId="FootnoteTextChar" w:type="character">
+    <w:name w:val="Footnote Text Char"/>
     <w:basedOn w:val="DefaultParagraphFont"/>
-    <w:link w:val="Subtitle"/>
-    <w:uiPriority w:val="11"/>
-    <w:rsid w:val="00A10FD9"/>
-    <w:rPr>
-      <w:rFonts w:cstheme="majorBidi" w:eastAsiaTheme="majorEastAsia"/>
-      <w:color w:themeColor="text1" w:themeTint="A6" w:val="595959"/>
-      <w:spacing w:val="15"/>
-      <w:sz w:val="28"/>
-      <w:szCs w:val="28"/>
-    </w:rPr>
-  </w:style>
-  <w:style w:customStyle="1" w:styleId="Author" w:type="paragraph">
-    <w:name w:val="Author"/>
-    <w:basedOn w:val="Title"/>
-    <w:next w:val="BodyText"/>
+    <w:link w:val="FootnoteText"/>
+    <w:uiPriority w:val="99"/>
+    <w:semiHidden/>
+    <w:unhideWhenUsed/>
+    <w:rPr>
+      <w:sz w:val="20"/>
+      <w:szCs w:val="20"/>
+    </w:rPr>
+  </w:style>
+  <w:style w:styleId="Heading1" w:type="paragraph">
+    <w:name w:val="Heading 1"/>
+    <w:basedOn w:val="Normal"/>
+    <w:next w:val="Normal"/>
     <w:qFormat/>
     <w:pPr>
-      <w:keepNext/>
-      <w:keepLines/>
-    </w:pPr>
-    <w:rPr>
-      <w:sz w:val="24"/>
-      <w:szCs w:val="24"/>
-    </w:rPr>
-  </w:style>
-  <w:style w:styleId="Date" w:type="paragraph">
-    <w:name w:val="Date"/>
-    <w:basedOn w:val="Title"/>
-    <w:next w:val="BodyText"/>
-    <w:qFormat/>
-    <w:pPr>
-      <w:keepNext/>
-      <w:keepLines/>
-    </w:pPr>
-    <w:rPr>
-      <w:sz w:val="24"/>
-      <w:szCs w:val="24"/>
-    </w:rPr>
-  </w:style>
-  <w:style w:customStyle="1" w:styleId="AbstractTitle" w:type="paragraph">
-    <w:name w:val="Abstract Title"/>
-    <w:basedOn w:val="Normal"/>
-    <w:next w:val="Abstract"/>
-    <w:qFormat/>
-    <w:pPr>
-      <w:keepNext/>
-      <w:keepLines/>
-      <w:spacing w:after="0" w:before="300"/>
-      <w:jc w:val="center"/>
-    </w:pPr>
-    <w:rPr>
-      <w:b/>
-      <w:sz w:val="20"/>
-      <w:szCs w:val="20"/>
-    </w:rPr>
-  </w:style>
-  <w:style w:customStyle="1" w:styleId="Abstract" w:type="paragraph">
-    <w:name w:val="Abstract"/>
-    <w:basedOn w:val="Normal"/>
-    <w:next w:val="BodyText"/>
-    <w:qFormat/>
-    <w:pPr>
-      <w:keepNext/>
-      <w:keepLines/>
-      <w:spacing w:after="300" w:before="100"/>
-    </w:pPr>
-    <w:rPr>
-      <w:sz w:val="20"/>
-      <w:szCs w:val="20"/>
-    </w:rPr>
-  </w:style>
-  <w:style w:styleId="Bibliography" w:type="paragraph">
-    <w:name w:val="Bibliography"/>
-    <w:basedOn w:val="Normal"/>
-    <w:next w:val="Bibliography"/>
-    <w:qFormat/>
-    <w:pPr/>
-    <w:rPr/>
-  </w:style>
-  <w:style w:styleId="Heading1" w:type="paragraph">
-    <w:name w:val="heading 1"/>
-    <w:basedOn w:val="Normal"/>
-    <w:next w:val="BodyText"/>
-    <w:link w:val="Heading1Char"/>
-    <w:uiPriority w:val="9"/>
-    <w:qFormat/>
-    <w:rsid w:val="00A10FD9"/>
-    <w:pPr>
-      <w:keepNext/>
-      <w:keepLines/>
-      <w:spacing w:after="80" w:before="360"/>
+      <w:spacing w:after="120" w:before="320"/>
       <w:outlineLvl w:val="0"/>
     </w:pPr>
     <w:rPr>
-      <w:rFonts w:asciiTheme="majorHAnsi" w:cstheme="majorBidi" w:eastAsiaTheme="majorEastAsia" w:hAnsiTheme="majorHAnsi"/>
-      <w:color w:themeColor="accent1" w:themeShade="BF" w:val="0F4761"/>
-      <w:sz w:val="40"/>
-      <w:szCs w:val="40"/>
-    </w:rPr>
-  </w:style>
-  <w:style w:styleId="Heading2" w:type="paragraph">
-    <w:name w:val="heading 2"/>
-    <w:basedOn w:val="Normal"/>
-    <w:next w:val="BodyText"/>
-    <w:link w:val="Heading2Char"/>
-    <w:uiPriority w:val="9"/>
-    <w:semiHidden/>
-    <w:unhideWhenUsed/>
-    <w:qFormat/>
-    <w:rsid w:val="00A10FD9"/>
-    <w:pPr>
-      <w:keepNext/>
-      <w:keepLines/>
-      <w:spacing w:after="80" w:before="160"/>
-      <w:outlineLvl w:val="1"/>
-    </w:pPr>
-    <w:rPr>
-      <w:rFonts w:asciiTheme="majorHAnsi" w:cstheme="majorBidi" w:eastAsiaTheme="majorEastAsia" w:hAnsiTheme="majorHAnsi"/>
-      <w:color w:themeColor="accent1" w:themeShade="BF" w:val="0F4761"/>
-      <w:sz w:val="32"/>
-      <w:szCs w:val="32"/>
-    </w:rPr>
-  </w:style>
-  <w:style w:styleId="Heading3" w:type="paragraph">
-    <w:name w:val="heading 3"/>
-    <w:basedOn w:val="Normal"/>
-    <w:next w:val="BodyText"/>
-    <w:link w:val="Heading3Char"/>
-    <w:uiPriority w:val="9"/>
-    <w:semiHidden/>
-    <w:unhideWhenUsed/>
-    <w:qFormat/>
-    <w:rsid w:val="00A10FD9"/>
-    <w:pPr>
-      <w:keepNext/>
-      <w:keepLines/>
-      <w:spacing w:after="80" w:before="160"/>
-      <w:outlineLvl w:val="2"/>
-    </w:pPr>
-    <w:rPr>
-      <w:rFonts w:cstheme="majorBidi" w:eastAsiaTheme="majorEastAsia"/>
-      <w:color w:themeColor="accent1" w:themeShade="BF" w:val="0F4761"/>
-      <w:sz w:val="28"/>
-      <w:szCs w:val="28"/>
-    </w:rPr>
-  </w:style>
-  <w:style w:styleId="Heading4" w:type="paragraph">
-    <w:name w:val="heading 4"/>
-    <w:basedOn w:val="Normal"/>
-    <w:next w:val="BodyText"/>
-    <w:link w:val="Heading4Char"/>
-    <w:uiPriority w:val="9"/>
-    <w:semiHidden/>
-    <w:unhideWhenUsed/>
-    <w:qFormat/>
-    <w:rsid w:val="00A10FD9"/>
-    <w:pPr>
-      <w:keepNext/>
-      <w:keepLines/>
-      <w:spacing w:after="40" w:before="80"/>
-      <w:outlineLvl w:val="3"/>
-    </w:pPr>
-    <w:rPr>
-      <w:rFonts w:cstheme="majorBidi" w:eastAsiaTheme="majorEastAsia"/>
-      <w:i/>
-      <w:iCs/>
-      <w:color w:themeColor="accent1" w:themeShade="BF" w:val="0F4761"/>
-    </w:rPr>
-  </w:style>
-  <w:style w:styleId="Heading5" w:type="paragraph">
-    <w:name w:val="heading 5"/>
-    <w:basedOn w:val="Normal"/>
-    <w:next w:val="BodyText"/>
-    <w:link w:val="Heading5Char"/>
-    <w:uiPriority w:val="9"/>
-    <w:semiHidden/>
-    <w:unhideWhenUsed/>
-    <w:qFormat/>
-    <w:rsid w:val="00A10FD9"/>
-    <w:pPr>
-      <w:keepNext/>
-      <w:keepLines/>
-      <w:spacing w:after="40" w:before="80"/>
-      <w:outlineLvl w:val="4"/>
-    </w:pPr>
-    <w:rPr>
-      <w:rFonts w:cstheme="majorBidi" w:eastAsiaTheme="majorEastAsia"/>
-      <w:color w:themeColor="accent1" w:themeShade="BF" w:val="0F4761"/>
-    </w:rPr>
-  </w:style>
-  <w:style w:styleId="Heading6" w:type="paragraph">
-    <w:name w:val="heading 6"/>
-    <w:basedOn w:val="Normal"/>
-    <w:next w:val="BodyText"/>
-    <w:link w:val="Heading6Char"/>
-    <w:uiPriority w:val="9"/>
-    <w:semiHidden/>
-    <w:unhideWhenUsed/>
-    <w:qFormat/>
-    <w:rsid w:val="00A10FD9"/>
-    <w:pPr>
-      <w:keepNext/>
-      <w:keepLines/>
-      <w:spacing w:after="0" w:before="40"/>
-      <w:outlineLvl w:val="5"/>
-    </w:pPr>
-    <w:rPr>
-      <w:rFonts w:cstheme="majorBidi" w:eastAsiaTheme="majorEastAsia"/>
-      <w:i/>
-      <w:iCs/>
-      <w:color w:themeColor="text1" w:themeTint="A6" w:val="595959"/>
-    </w:rPr>
-  </w:style>
-  <w:style w:styleId="Heading7" w:type="paragraph">
-    <w:name w:val="heading 7"/>
-    <w:basedOn w:val="Normal"/>
-    <w:next w:val="BodyText"/>
-    <w:link w:val="Heading7Char"/>
-    <w:uiPriority w:val="9"/>
-    <w:semiHidden/>
-    <w:unhideWhenUsed/>
-    <w:qFormat/>
-    <w:rsid w:val="00A10FD9"/>
-    <w:pPr>
-      <w:keepNext/>
-      <w:keepLines/>
-      <w:spacing w:after="0" w:before="40"/>
-      <w:outlineLvl w:val="6"/>
-    </w:pPr>
-    <w:rPr>
-      <w:rFonts w:cstheme="majorBidi" w:eastAsiaTheme="majorEastAsia"/>
-      <w:color w:themeColor="text1" w:themeTint="A6" w:val="595959"/>
-    </w:rPr>
-  </w:style>
-  <w:style w:styleId="Heading8" w:type="paragraph">
-    <w:name w:val="heading 8"/>
-    <w:basedOn w:val="Normal"/>
-    <w:next w:val="BodyText"/>
-    <w:link w:val="Heading8Char"/>
-    <w:uiPriority w:val="9"/>
-    <w:semiHidden/>
-    <w:unhideWhenUsed/>
-    <w:qFormat/>
-    <w:rsid w:val="00A10FD9"/>
-    <w:pPr>
-      <w:keepNext/>
-      <w:keepLines/>
-      <w:spacing w:after="0"/>
-      <w:outlineLvl w:val="7"/>
-    </w:pPr>
-    <w:rPr>
-      <w:rFonts w:cstheme="majorBidi" w:eastAsiaTheme="majorEastAsia"/>
-      <w:i/>
-      <w:iCs/>
-      <w:color w:themeColor="text1" w:themeTint="D8" w:val="272727"/>
-    </w:rPr>
-  </w:style>
-  <w:style w:styleId="Heading9" w:type="paragraph">
-    <w:name w:val="heading 9"/>
-    <w:basedOn w:val="Normal"/>
-    <w:next w:val="BodyText"/>
-    <w:link w:val="Heading9Char"/>
-    <w:uiPriority w:val="9"/>
-    <w:semiHidden/>
-    <w:unhideWhenUsed/>
-    <w:qFormat/>
-    <w:rsid w:val="00A10FD9"/>
-    <w:pPr>
-      <w:keepNext/>
-      <w:keepLines/>
-      <w:spacing w:after="0"/>
-      <w:outlineLvl w:val="8"/>
-    </w:pPr>
-    <w:rPr>
-      <w:rFonts w:cstheme="majorBidi" w:eastAsiaTheme="majorEastAsia"/>
-      <w:color w:themeColor="text1" w:themeTint="D8" w:val="272727"/>
-    </w:rPr>
-  </w:style>
-  <w:style w:customStyle="1" w:styleId="Heading1Char" w:type="character">
-    <w:name w:val="Heading 1 Char"/>
-    <w:basedOn w:val="DefaultParagraphFont"/>
-    <w:link w:val="Heading1"/>
-    <w:uiPriority w:val="9"/>
-    <w:rsid w:val="00A10FD9"/>
-    <w:rPr>
-      <w:rFonts w:asciiTheme="majorHAnsi" w:cstheme="majorBidi" w:eastAsiaTheme="majorEastAsia" w:hAnsiTheme="majorHAnsi"/>
-      <w:color w:themeColor="accent1" w:themeShade="BF" w:val="0F4761"/>
-      <w:sz w:val="40"/>
-      <w:szCs w:val="40"/>
-    </w:rPr>
-  </w:style>
-  <w:style w:customStyle="1" w:styleId="Heading2Char" w:type="character">
-    <w:name w:val="Heading 2 Char"/>
-    <w:basedOn w:val="DefaultParagraphFont"/>
-    <w:link w:val="Heading2"/>
-    <w:uiPriority w:val="9"/>
-    <w:semiHidden/>
-    <w:rsid w:val="00A10FD9"/>
-    <w:rPr>
-      <w:rFonts w:asciiTheme="majorHAnsi" w:cstheme="majorBidi" w:eastAsiaTheme="majorEastAsia" w:hAnsiTheme="majorHAnsi"/>
-      <w:color w:themeColor="accent1" w:themeShade="BF" w:val="0F4761"/>
-      <w:sz w:val="32"/>
-      <w:szCs w:val="32"/>
-    </w:rPr>
-  </w:style>
-  <w:style w:customStyle="1" w:styleId="Heading3Char" w:type="character">
-    <w:name w:val="Heading 3 Char"/>
-    <w:basedOn w:val="DefaultParagraphFont"/>
-    <w:link w:val="Heading3"/>
-    <w:uiPriority w:val="9"/>
-    <w:semiHidden/>
-    <w:rsid w:val="00A10FD9"/>
-    <w:rPr>
-      <w:rFonts w:cstheme="majorBidi" w:eastAsiaTheme="majorEastAsia"/>
-      <w:color w:themeColor="accent1" w:themeShade="BF" w:val="0F4761"/>
-      <w:sz w:val="28"/>
-      <w:szCs w:val="28"/>
-    </w:rPr>
-  </w:style>
-  <w:style w:customStyle="1" w:styleId="Heading4Char" w:type="character">
-    <w:name w:val="Heading 4 Char"/>
-    <w:basedOn w:val="DefaultParagraphFont"/>
-    <w:link w:val="Heading4"/>
-    <w:uiPriority w:val="9"/>
-    <w:semiHidden/>
-    <w:rsid w:val="00A10FD9"/>
-    <w:rPr>
-      <w:rFonts w:cstheme="majorBidi" w:eastAsiaTheme="majorEastAsia"/>
-      <w:i/>
-      <w:iCs/>
-      <w:color w:themeColor="accent1" w:themeShade="BF" w:val="0F4761"/>
-    </w:rPr>
-  </w:style>
-  <w:style w:customStyle="1" w:styleId="Heading5Char" w:type="character">
-    <w:name w:val="Heading 5 Char"/>
-    <w:basedOn w:val="DefaultParagraphFont"/>
-    <w:link w:val="Heading5"/>
-    <w:uiPriority w:val="9"/>
-    <w:semiHidden/>
-    <w:rsid w:val="00A10FD9"/>
-    <w:rPr>
-      <w:rFonts w:cstheme="majorBidi" w:eastAsiaTheme="majorEastAsia"/>
-      <w:color w:themeColor="accent1" w:themeShade="BF" w:val="0F4761"/>
-    </w:rPr>
-  </w:style>
-  <w:style w:customStyle="1" w:styleId="Heading6Char" w:type="character">
-    <w:name w:val="Heading 6 Char"/>
-    <w:basedOn w:val="DefaultParagraphFont"/>
-    <w:link w:val="Heading6"/>
-    <w:uiPriority w:val="9"/>
-    <w:semiHidden/>
-    <w:rsid w:val="00A10FD9"/>
-    <w:rPr>
-      <w:rFonts w:cstheme="majorBidi" w:eastAsiaTheme="majorEastAsia"/>
-      <w:i/>
-      <w:iCs/>
-      <w:color w:themeColor="text1" w:themeTint="A6" w:val="595959"/>
-    </w:rPr>
-  </w:style>
-  <w:style w:customStyle="1" w:styleId="Heading7Char" w:type="character">
-    <w:name w:val="Heading 7 Char"/>
-    <w:basedOn w:val="DefaultParagraphFont"/>
-    <w:link w:val="Heading7"/>
-    <w:uiPriority w:val="9"/>
-    <w:semiHidden/>
-    <w:rsid w:val="00A10FD9"/>
-    <w:rPr>
-      <w:rFonts w:cstheme="majorBidi" w:eastAsiaTheme="majorEastAsia"/>
-      <w:color w:themeColor="text1" w:themeTint="A6" w:val="595959"/>
-    </w:rPr>
-  </w:style>
-  <w:style w:customStyle="1" w:styleId="Heading8Char" w:type="character">
-    <w:name w:val="Heading 8 Char"/>
-    <w:basedOn w:val="DefaultParagraphFont"/>
-    <w:link w:val="Heading8"/>
-    <w:uiPriority w:val="9"/>
-    <w:semiHidden/>
-    <w:rsid w:val="00A10FD9"/>
-    <w:rPr>
-      <w:rFonts w:cstheme="majorBidi" w:eastAsiaTheme="majorEastAsia"/>
-      <w:i/>
-      <w:iCs/>
-      <w:color w:themeColor="text1" w:themeTint="D8" w:val="272727"/>
-    </w:rPr>
-  </w:style>
-  <w:style w:customStyle="1" w:styleId="Heading9Char" w:type="character">
-    <w:name w:val="Heading 9 Char"/>
-    <w:basedOn w:val="DefaultParagraphFont"/>
-    <w:link w:val="Heading9"/>
-    <w:uiPriority w:val="9"/>
-    <w:semiHidden/>
-    <w:rsid w:val="00A10FD9"/>
-    <w:rPr>
-      <w:rFonts w:cstheme="majorBidi" w:eastAsiaTheme="majorEastAsia"/>
-      <w:color w:themeColor="text1" w:themeTint="D8" w:val="272727"/>
-    </w:rPr>
-  </w:style>
-  <w:style w:styleId="BlockText" w:type="paragraph">
-    <w:name w:val="Block Text"/>
-    <w:basedOn w:val="BodyText"/>
-    <w:next w:val="BodyText"/>
-    <w:uiPriority w:val="9"/>
-    <w:unhideWhenUsed/>
-    <w:qFormat/>
-    <w:pPr>
-      <w:spacing w:after="100" w:before="100"/>
-      <w:ind w:firstLine="0" w:left="480" w:right="480"/>
-    </w:pPr>
-  </w:style>
-  <w:style w:styleId="FootnoteText" w:type="paragraph">
-    <w:name w:val="Footnote Text"/>
-    <w:basedOn w:val="Normal"/>
-    <w:next w:val="FootnoteText"/>
-    <w:uiPriority w:val="9"/>
-    <w:unhideWhenUsed/>
-    <w:qFormat/>
-  </w:style>
-  <w:style w:styleId="FootnoteBlockText" w:type="paragraph">
-    <w:name w:val="Footnote Block Text"/>
-    <w:basedOn w:val="FootnoteText"/>
-    <w:next w:val="FootnoteText"/>
-    <w:uiPriority w:val="9"/>
-    <w:unhideWhenUsed/>
-    <w:qFormat/>
-    <w:pPr>
-      <w:spacing w:after="100" w:before="100"/>
-      <w:ind w:firstLine="0" w:left="480" w:right="480"/>
-    </w:pPr>
-  </w:style>
-  <w:style w:default="1" w:styleId="DefaultParagraphFont" w:type="character">
-    <w:name w:val="Default Paragraph Font"/>
-    <w:semiHidden/>
-    <w:unhideWhenUsed/>
-  </w:style>
-  <w:style w:default="1" w:styleId="Table" w:type="table">
-    <w:name w:val="Table"/>
-    <w:basedOn w:val="TableNormal"/>
-    <w:semiHidden/>
-    <w:unhideWhenUsed/>
-    <w:qFormat/>
-    <w:tblPr>
-      <w:tblInd w:type="dxa" w:w="0"/>
-      <w:tblCellMar>
-        <w:top w:type="dxa" w:w="0"/>
-        <w:left w:type="dxa" w:w="108"/>
-        <w:bottom w:type="dxa" w:w="0"/>
-        <w:right w:type="dxa" w:w="108"/>
-      </w:tblCellMar>
-    </w:tblPr>
-    <w:tblStylePr w:type="firstRow">
-      <w:tcPr>
-        <w:tcBorders>
-          <w:bottom w:val="single"/>
-        </w:tcBorders>
-        <w:vAlign w:val="bottom"/>
-      </w:tcPr>
-    </w:tblStylePr>
-  </w:style>
-  <w:style w:customStyle="1" w:styleId="DefinitionTerm" w:type="paragraph">
-    <w:name w:val="Definition Term"/>
-    <w:basedOn w:val="Normal"/>
-    <w:next w:val="Definition"/>
-    <w:pPr>
-      <w:keepNext/>
-      <w:keepLines/>
-      <w:spacing w:after="0"/>
-    </w:pPr>
-    <w:rPr>
+      <w:rFonts w:ascii="Arial" w:cs="Arial" w:eastAsia="Arial" w:hAnsi="Arial"/>
       <w:b/>
-    </w:rPr>
-  </w:style>
-  <w:style w:customStyle="1" w:styleId="Definition" w:type="paragraph">
-    <w:name w:val="Definition"/>
-    <w:basedOn w:val="Normal"/>
-  </w:style>
-  <w:style w:styleId="Caption" w:type="paragraph">
-    <w:name w:val="Caption"/>
-    <w:basedOn w:val="Normal"/>
-    <w:link w:val="BodyTextChar"/>
-    <w:pPr>
-      <w:spacing w:after="120" w:before="0"/>
-    </w:pPr>
-    <w:rPr>
-      <w:i/>
-    </w:rPr>
-  </w:style>
-  <w:style w:customStyle="1" w:styleId="TableCaption" w:type="paragraph">
-    <w:name w:val="Table Caption"/>
-    <w:basedOn w:val="Caption"/>
-    <w:pPr>
-      <w:keepNext/>
-    </w:pPr>
-  </w:style>
-  <w:style w:customStyle="1" w:styleId="ImageCaption" w:type="paragraph">
-    <w:name w:val="Image Caption"/>
-    <w:basedOn w:val="Caption"/>
-  </w:style>
-  <w:style w:customStyle="1" w:styleId="Figure" w:type="paragraph">
-    <w:name w:val="Figure"/>
-    <w:basedOn w:val="Normal"/>
-  </w:style>
-  <w:style w:customStyle="1" w:styleId="CaptionedFigure" w:type="paragraph">
-    <w:name w:val="Captioned Figure"/>
-    <w:basedOn w:val="Figure"/>
-    <w:pPr>
-      <w:keepNext/>
-    </w:pPr>
-  </w:style>
-  <w:style w:customStyle="1" w:styleId="BodyTextChar" w:type="character">
-    <w:name w:val="Body Text Char"/>
-    <w:basedOn w:val="DefaultParagraphFont"/>
-    <w:link w:val="BodyText"/>
-  </w:style>
-  <w:style w:customStyle="1" w:styleId="VerbatimChar" w:type="character">
-    <w:name w:val="Verbatim Char"/>
-    <w:basedOn w:val="BodyTextChar"/>
-    <w:rPr>
-      <w:rFonts w:ascii="Consolas" w:hAnsi="Consolas"/>
+      <w:bCs/>
+      <w:color w:val="1B3A6B"/>
       <w:sz w:val="22"/>
-    </w:rPr>
-  </w:style>
-  <w:style w:customStyle="1" w:styleId="SectionNumber" w:type="character">
-    <w:name w:val="Section Number"/>
-    <w:basedOn w:val="BodyTextChar"/>
-  </w:style>
-  <w:style w:styleId="FootnoteReference" w:type="character">
-    <w:name w:val="Footnote Reference"/>
-    <w:basedOn w:val="BodyTextChar"/>
-    <w:rPr>
-      <w:vertAlign w:val="superscript"/>
-    </w:rPr>
-  </w:style>
-  <w:style w:styleId="Hyperlink" w:type="character">
-    <w:name w:val="Hyperlink"/>
-    <w:basedOn w:val="BodyTextChar"/>
-    <w:rPr>
-      <w:color w:themeColor="accent1" w:val="4F81BD"/>
-    </w:rPr>
-  </w:style>
-  <w:style w:styleId="TOCHeading" w:type="paragraph">
-    <w:name w:val="TOC Heading"/>
-    <w:basedOn w:val="Heading1"/>
-    <w:next w:val="BodyText"/>
-    <w:uiPriority w:val="39"/>
-    <w:unhideWhenUsed/>
-    <w:qFormat/>
-    <w:pPr>
-      <w:spacing w:before="240" w:line="259" w:lineRule="auto"/>
-      <w:outlineLvl w:val="9"/>
-    </w:pPr>
-    <w:rPr>
-      <w:rFonts w:asciiTheme="majorHAnsi" w:cstheme="majorBidi" w:eastAsiaTheme="majorEastAsia" w:hAnsiTheme="majorHAnsi"/>
-      <w:b w:val="0"/>
-      <w:bCs w:val="0"/>
-      <w:color w:themeColor="accent1" w:themeShade="BF" w:val="365F91"/>
+      <w:szCs w:val="22"/>
     </w:rPr>
   </w:style>
   <w:style w:type="paragraph" w:customStyle="1" w:styleId="SourceCode">

</xml_diff>